<commit_message>
Maqola docx faylidagi buzilgan paragrafni tuzatish
Avvalgi versiyada bitta paragraf notog'ri generatsiya qilingani sababli
fayl Word'da ochilmayotgan edi. OOXML sxema validatsiyasidan o'tkazildi.

Co-Authored-By: Claude Sonnet 5 <noreply@anthropic.com>
Claude-Session: https://claude.ai/code/session_01YNzCBUJD6YhooefBuDBfxy
</commit_message>
<xml_diff>
--- a/maqolalar/Xorazm_vohasi_areal_tadqiq_konferensiya.docx
+++ b/maqolalar/Xorazm_vohasi_areal_tadqiq_konferensiya.docx
@@ -95,53 +95,193 @@
         <w:spacing w:after="200" w:line="360" w:lineRule="auto"/>
         <w:jc w:val="both"/>
       </w:pPr>
-      <text>Annotatsiya. </text>
-      <text>Mazkur maqolada Xorazm vohasi o'zbek shevalarini areal o'rganishning nazariy-metodologik asoslari, shu jumladan jahon va o'zbek tilshunosligidagi areal-lingvogeografik yondashuvlar tahlil qilingan, shuningdek Xorazm shevalarini o'rganish tarixi tizimli tarzda yoritilgan. Shu asosda lingvistik xaritalar yaratish nafaqat o'zbek tilining, balki turkiy tillarning dolzarb muammolarini hal etishga xizmat qilishi asoslab berilgan.</text>
-    </w:p>
-    <w:p>
-      <w:pPr>
-        <w:spacing w:after="200" w:line="360" w:lineRule="auto"/>
-        <w:jc w:val="both"/>
-      </w:pPr>
-      <text>Kalit so'zlar: </text>
-      <text>areal tadqiq, areal lingvistika, lingvogeografiya, o'zbek shevalari, Xorazm shevalari, oraliq shevalar, izoglossa, lingvistik xarita.</text>
-    </w:p>
-    <w:p>
-      <w:pPr>
-        <w:spacing w:after="200" w:line="360" w:lineRule="auto"/>
-        <w:jc w:val="both"/>
-      </w:pPr>
-      <text>Abstract. </text>
-      <text>This article substantiates the theoretical and methodological foundations of the areal study of the Uzbek dialects of the Khorezm oasis, analyzing areal-linguogeographic approaches in world and Uzbek linguistics, and provides a systematic overview of the history of research on Khorezm dialects. It is argued that creating linguistic maps on this basis will help solve current problems not only of the Uzbek language, but also of Turkic languages in general.</text>
-    </w:p>
-    <w:p>
-      <w:pPr>
-        <w:spacing w:after="200" w:line="360" w:lineRule="auto"/>
-        <w:jc w:val="both"/>
-      </w:pPr>
-      <text>Keywords: </text>
-      <text>areal study, areal linguistics, linguogeography, Uzbek dialects, Khorezm dialects, transitional dialects, isogloss, linguistic map.</text>
-    </w:p>
-    <w:p>
-      <w:pPr>
-        <w:spacing w:after="200" w:line="360" w:lineRule="auto"/>
-        <w:jc w:val="both"/>
-      </w:pPr>
-      <text>Аннотация. </text>
-      <text>В статье обосновываются теоретико-методологические основы ареального изучения узбекских диалектов Хорезмского оазиса, анализируются ареально-лингвогеографические подходы в мировом и узбекском языкознании, а также системно освещается история изучения хорезмских диалектов. Обосновывается, что создание на этой основе лингвистических карт будет способствовать решению актуальных проблем не только узбекского языка, но и тюркских языков.</text>
+      <w:r>
+        <w:rPr>
+          <w:rFonts w:ascii="Times New Roman" w:cs="Times New Roman" w:eastAsia="Times New Roman" w:hAnsi="Times New Roman"/>
+          <w:b/>
+          <w:bCs/>
+          <w:i w:val="false"/>
+          <w:iCs w:val="false"/>
+          <w:sz w:val="28"/>
+          <w:szCs w:val="28"/>
+        </w:rPr>
+        <w:t xml:space="preserve">Annotatsiya. </w:t>
+      </w:r>
+      <w:r>
+        <w:rPr>
+          <w:rFonts w:ascii="Times New Roman" w:cs="Times New Roman" w:eastAsia="Times New Roman" w:hAnsi="Times New Roman"/>
+          <w:b w:val="false"/>
+          <w:bCs w:val="false"/>
+          <w:i w:val="false"/>
+          <w:iCs w:val="false"/>
+          <w:sz w:val="28"/>
+          <w:szCs w:val="28"/>
+        </w:rPr>
+        <w:t xml:space="preserve">Mazkur maqolada Xorazm vohasi o'zbek shevalarini areal o'rganishning nazariy-metodologik asoslari, shu jumladan jahon va o'zbek tilshunosligidagi areal-lingvogeografik yondashuvlar tahlil qilingan, shuningdek Xorazm shevalarini o'rganish tarixi tizimli tarzda yoritilgan. Shu asosda lingvistik xaritalar yaratish nafaqat o'zbek tilining, balki turkiy tillarning dolzarb muammolarini hal etishga xizmat qilishi asoslab berilgan.</w:t>
+      </w:r>
+    </w:p>
+    <w:p>
+      <w:pPr>
+        <w:spacing w:after="200" w:line="360" w:lineRule="auto"/>
+        <w:jc w:val="both"/>
+      </w:pPr>
+      <w:r>
+        <w:rPr>
+          <w:rFonts w:ascii="Times New Roman" w:cs="Times New Roman" w:eastAsia="Times New Roman" w:hAnsi="Times New Roman"/>
+          <w:b/>
+          <w:bCs/>
+          <w:i w:val="false"/>
+          <w:iCs w:val="false"/>
+          <w:sz w:val="28"/>
+          <w:szCs w:val="28"/>
+        </w:rPr>
+        <w:t xml:space="preserve">Kalit so'zlar: </w:t>
+      </w:r>
+      <w:r>
+        <w:rPr>
+          <w:rFonts w:ascii="Times New Roman" w:cs="Times New Roman" w:eastAsia="Times New Roman" w:hAnsi="Times New Roman"/>
+          <w:b w:val="false"/>
+          <w:bCs w:val="false"/>
+          <w:i w:val="false"/>
+          <w:iCs w:val="false"/>
+          <w:sz w:val="28"/>
+          <w:szCs w:val="28"/>
+        </w:rPr>
+        <w:t xml:space="preserve">areal tadqiq, areal lingvistika, lingvogeografiya, o'zbek shevalari, Xorazm shevalari, oraliq shevalar, izoglossa, lingvistik xarita.</w:t>
+      </w:r>
+    </w:p>
+    <w:p>
+      <w:pPr>
+        <w:spacing w:after="200" w:line="360" w:lineRule="auto"/>
+        <w:jc w:val="both"/>
+      </w:pPr>
+      <w:r>
+        <w:rPr>
+          <w:rFonts w:ascii="Times New Roman" w:cs="Times New Roman" w:eastAsia="Times New Roman" w:hAnsi="Times New Roman"/>
+          <w:b/>
+          <w:bCs/>
+          <w:i/>
+          <w:iCs/>
+          <w:sz w:val="28"/>
+          <w:szCs w:val="28"/>
+        </w:rPr>
+        <w:t xml:space="preserve">Abstract. </w:t>
+      </w:r>
+      <w:r>
+        <w:rPr>
+          <w:rFonts w:ascii="Times New Roman" w:cs="Times New Roman" w:eastAsia="Times New Roman" w:hAnsi="Times New Roman"/>
+          <w:b w:val="false"/>
+          <w:bCs w:val="false"/>
+          <w:i/>
+          <w:iCs/>
+          <w:sz w:val="28"/>
+          <w:szCs w:val="28"/>
+        </w:rPr>
+        <w:t xml:space="preserve">This article substantiates the theoretical and methodological foundations of the areal study of the Uzbek dialects of the Khorezm oasis, analyzing areal-linguogeographic approaches in world and Uzbek linguistics, and provides a systematic overview of the history of research on Khorezm dialects. It is argued that creating linguistic maps on this basis will help solve current problems not only of the Uzbek language, but also of Turkic languages in general.</w:t>
+      </w:r>
+    </w:p>
+    <w:p>
+      <w:pPr>
+        <w:spacing w:after="200" w:line="360" w:lineRule="auto"/>
+        <w:jc w:val="both"/>
+      </w:pPr>
+      <w:r>
+        <w:rPr>
+          <w:rFonts w:ascii="Times New Roman" w:cs="Times New Roman" w:eastAsia="Times New Roman" w:hAnsi="Times New Roman"/>
+          <w:b/>
+          <w:bCs/>
+          <w:i/>
+          <w:iCs/>
+          <w:sz w:val="28"/>
+          <w:szCs w:val="28"/>
+        </w:rPr>
+        <w:t xml:space="preserve">Keywords: </w:t>
+      </w:r>
+      <w:r>
+        <w:rPr>
+          <w:rFonts w:ascii="Times New Roman" w:cs="Times New Roman" w:eastAsia="Times New Roman" w:hAnsi="Times New Roman"/>
+          <w:b w:val="false"/>
+          <w:bCs w:val="false"/>
+          <w:i/>
+          <w:iCs/>
+          <w:sz w:val="28"/>
+          <w:szCs w:val="28"/>
+        </w:rPr>
+        <w:t xml:space="preserve">areal study, areal linguistics, linguogeography, Uzbek dialects, Khorezm dialects, transitional dialects, isogloss, linguistic map.</w:t>
+      </w:r>
+    </w:p>
+    <w:p>
+      <w:pPr>
+        <w:spacing w:after="200" w:line="360" w:lineRule="auto"/>
+        <w:jc w:val="both"/>
+      </w:pPr>
+      <w:r>
+        <w:rPr>
+          <w:rFonts w:ascii="Times New Roman" w:cs="Times New Roman" w:eastAsia="Times New Roman" w:hAnsi="Times New Roman"/>
+          <w:b/>
+          <w:bCs/>
+          <w:i w:val="false"/>
+          <w:iCs w:val="false"/>
+          <w:sz w:val="28"/>
+          <w:szCs w:val="28"/>
+        </w:rPr>
+        <w:t xml:space="preserve">Аннотация. </w:t>
+      </w:r>
+      <w:r>
+        <w:rPr>
+          <w:rFonts w:ascii="Times New Roman" w:cs="Times New Roman" w:eastAsia="Times New Roman" w:hAnsi="Times New Roman"/>
+          <w:b w:val="false"/>
+          <w:bCs w:val="false"/>
+          <w:i w:val="false"/>
+          <w:iCs w:val="false"/>
+          <w:sz w:val="28"/>
+          <w:szCs w:val="28"/>
+        </w:rPr>
+        <w:t xml:space="preserve">В статье обосновываются теоретико-методологические основы ареального изучения узбекских диалектов Хорезмского оазиса, анализируются ареально-лингвогеографические подходы в мировом и узбекском языкознании, а также системно освещается история изучения хорезмских диалектов. Обосновывается, что создание на этой основе лингвистических карт будет способствовать решению актуальных проблем не только узбекского языка, но и тюркских языков.</w:t>
+      </w:r>
     </w:p>
     <w:p>
       <w:pPr>
         <w:spacing w:after="400" w:line="360" w:lineRule="auto"/>
         <w:jc w:val="both"/>
       </w:pPr>
-      <text>Ключевые слова: </text>
-      <text>ареальное исследование, ареальная лингвистика, лингвогеография, узбекские диалекты, хорезмские диалекты, переходные говоры, изоглосса, лингвистическая карта.</text>
+      <w:r>
+        <w:rPr>
+          <w:rFonts w:ascii="Times New Roman" w:cs="Times New Roman" w:eastAsia="Times New Roman" w:hAnsi="Times New Roman"/>
+          <w:b/>
+          <w:bCs/>
+          <w:i w:val="false"/>
+          <w:iCs w:val="false"/>
+          <w:sz w:val="28"/>
+          <w:szCs w:val="28"/>
+        </w:rPr>
+        <w:t xml:space="preserve">Ключевые слова: </w:t>
+      </w:r>
+      <w:r>
+        <w:rPr>
+          <w:rFonts w:ascii="Times New Roman" w:cs="Times New Roman" w:eastAsia="Times New Roman" w:hAnsi="Times New Roman"/>
+          <w:b w:val="false"/>
+          <w:bCs w:val="false"/>
+          <w:i w:val="false"/>
+          <w:iCs w:val="false"/>
+          <w:sz w:val="28"/>
+          <w:szCs w:val="28"/>
+        </w:rPr>
+        <w:t xml:space="preserve">ареальное исследование, ареальная лингвистика, лингвогеография, узбекские диалекты, хорезмские диалекты, переходные говоры, изоглосса, лингвистическая карта.</w:t>
+      </w:r>
     </w:p>
     <w:p>
       <w:pPr>
         <w:spacing w:after="400" w:line="360" w:lineRule="auto"/>
       </w:pPr>
+      <w:r>
+        <w:rPr>
+          <w:rFonts w:ascii="Times New Roman" w:cs="Times New Roman" w:eastAsia="Times New Roman" w:hAnsi="Times New Roman"/>
+          <w:sz w:val="28"/>
+          <w:szCs w:val="28"/>
+        </w:rPr>
+        <w:t xml:space="preserve"/>
+      </w:r>
     </w:p>
     <w:p>
       <w:pPr>
@@ -415,8 +555,30 @@
         <w:ind w:firstLine="567"/>
         <w:jc w:val="both"/>
       </w:pPr>
-      <text>Xulosa. </text>
-      <text>Yuqorida keltirilgan tahlildan ko'rinadiki, Xorazm vohasi o'zbek shevalari turli yo'nalishlarda — markaziy tasnif, chegaradosh hududlar, ichki mikrohududlar, qo'shni til bilan qiyosiy aloqa, tarixiy-yozma manbalar nuqtai nazaridan — ancha keng va xilma-xil tadqiq etilgan. Shunga qaramay, bu tadqiqotlarning aksariyati alohida-alohida, ko'pincha bir sheva yoki bir aspekt doirasida olib borilgan bo'lib, ularni yagona areal-lingvogeografik model asosida, izoglossalar tizimi va dialektal zonalanish nuqtai nazaridan yaxlit tadqiq etish, shu asosda lingvistik xarita yaratish hozirgacha to'liq amalga oshirilmagan. Aynan shu bo'shliqni to'ldirish Xorazm vohasi o'zbek shevalarini areal tadqiq etishning dolzarbligini belgilaydi va uni nafaqat o'zbek tilshunosligi, balki turkiy tillar tilshunosligi uchun ham muhim ilmiy-amaliy ahamiyat kasb ettiradi.</text>
+      <w:r>
+        <w:rPr>
+          <w:rFonts w:ascii="Times New Roman" w:cs="Times New Roman" w:eastAsia="Times New Roman" w:hAnsi="Times New Roman"/>
+          <w:b/>
+          <w:bCs/>
+          <w:i w:val="false"/>
+          <w:iCs w:val="false"/>
+          <w:sz w:val="28"/>
+          <w:szCs w:val="28"/>
+        </w:rPr>
+        <w:t xml:space="preserve">Xulosa. </w:t>
+      </w:r>
+      <w:r>
+        <w:rPr>
+          <w:rFonts w:ascii="Times New Roman" w:cs="Times New Roman" w:eastAsia="Times New Roman" w:hAnsi="Times New Roman"/>
+          <w:b w:val="false"/>
+          <w:bCs w:val="false"/>
+          <w:i w:val="false"/>
+          <w:iCs w:val="false"/>
+          <w:sz w:val="28"/>
+          <w:szCs w:val="28"/>
+        </w:rPr>
+        <w:t xml:space="preserve">Yuqorida keltirilgan tahlildan ko'rinadiki, Xorazm vohasi o'zbek shevalari turli yo'nalishlarda — markaziy tasnif, chegaradosh hududlar, ichki mikrohududlar, qo'shni til bilan qiyosiy aloqa, tarixiy-yozma manbalar nuqtai nazaridan — ancha keng va xilma-xil tadqiq etilgan. Shunga qaramay, bu tadqiqotlarning aksariyati alohida-alohida, ko'pincha bir sheva yoki bir aspekt doirasida olib borilgan bo'lib, ularni yagona areal-lingvogeografik model asosida, izoglossalar tizimi va dialektal zonalanish nuqtai nazaridan yaxlit tadqiq etish, shu asosda lingvistik xarita yaratish hozirgacha to'liq amalga oshirilmagan. Aynan shu bo'shliqni to'ldirish Xorazm vohasi o'zbek shevalarini areal tadqiq etishning dolzarbligini belgilaydi va uni nafaqat o'zbek tilshunosligi, balki turkiy tillar tilshunosligi uchun ham muhim ilmiy-amaliy ahamiyat kasb ettiradi.</w:t>
+      </w:r>
     </w:p>
     <w:p>
       <w:pPr>

</xml_diff>